<commit_message>
:books: docs: Corrigindo erros na documentação
</commit_message>
<xml_diff>
--- a/Documents/Sprint11_Task058_DesenvolverCompany.docx
+++ b/Documents/Sprint11_Task058_DesenvolverCompany.docx
@@ -1182,22 +1182,18 @@
       </w:r>
     </w:p>
     <w:p>
-      <w:r>
-        <w:rPr>
-          <w:rFonts w:ascii="Segoe UI Emoji" w:hAnsi="Segoe UI Emoji" w:cs="Segoe UI Emoji"/>
-        </w:rPr>
-        <w:t>🎣</w:t>
-      </w:r>
-      <w:r>
-        <w:t xml:space="preserve"> </w:t>
+      <w:bookmarkStart w:id="0" w:name="_GoBack"/>
+      <w:bookmarkEnd w:id="0"/>
+      <w:r>
+        <w:t>Ho</w:t>
       </w:r>
       <w:proofErr w:type="spellStart"/>
       <w:r>
-        <w:t>Hooks</w:t>
+        <w:t>oks e</w:t>
       </w:r>
       <w:proofErr w:type="spellEnd"/>
       <w:r>
-        <w:t xml:space="preserve"> e Lógica de Negócio</w:t>
+        <w:t xml:space="preserve"> Lógica de Negócio</w:t>
       </w:r>
     </w:p>
     <w:p>
@@ -1377,8 +1373,6 @@
       <w:r>
         <w:t xml:space="preserve"> de novos desenvolvedores.</w:t>
       </w:r>
-      <w:bookmarkStart w:id="0" w:name="_GoBack"/>
-      <w:bookmarkEnd w:id="0"/>
     </w:p>
     <w:p>
       <w:r>
@@ -4324,6 +4318,12 @@
 </file>
 
 <file path=customXml/item1.xml><?xml version="1.0" encoding="utf-8"?>
+<p:properties xmlns:p="http://schemas.microsoft.com/office/2006/metadata/properties" xmlns:xsi="http://www.w3.org/2001/XMLSchema-instance" xmlns:pc="http://schemas.microsoft.com/office/infopath/2007/PartnerControls">
+  <documentManagement/>
+</p:properties>
+</file>
+
+<file path=customXml/item2.xml><?xml version="1.0" encoding="utf-8"?>
 <ct:contentTypeSchema xmlns:ct="http://schemas.microsoft.com/office/2006/metadata/contentType" xmlns:ma="http://schemas.microsoft.com/office/2006/metadata/properties/metaAttributes" ct:_="" ma:_="" ma:contentTypeName="Documento" ma:contentTypeID="0x010100B37008164333CE47B7554A23BF4CE40A" ma:contentTypeVersion="3" ma:contentTypeDescription="Crie um novo documento." ma:contentTypeScope="" ma:versionID="01d70e1db2e5282cbeb036b3d8462683">
   <xsd:schema xmlns:xsd="http://www.w3.org/2001/XMLSchema" xmlns:xs="http://www.w3.org/2001/XMLSchema" xmlns:p="http://schemas.microsoft.com/office/2006/metadata/properties" xmlns:ns2="0dd540f2-19ea-4199-a9ce-e531162f98d7" targetNamespace="http://schemas.microsoft.com/office/2006/metadata/properties" ma:root="true" ma:fieldsID="b0ca1735cf6dfdacfbf35c674503d2b1" ns2:_="">
     <xsd:import namespace="0dd540f2-19ea-4199-a9ce-e531162f98d7"/>
@@ -4461,12 +4461,6 @@
 </ct:contentTypeSchema>
 </file>
 
-<file path=customXml/item2.xml><?xml version="1.0" encoding="utf-8"?>
-<p:properties xmlns:p="http://schemas.microsoft.com/office/2006/metadata/properties" xmlns:xsi="http://www.w3.org/2001/XMLSchema-instance" xmlns:pc="http://schemas.microsoft.com/office/infopath/2007/PartnerControls">
-  <documentManagement/>
-</p:properties>
-</file>
-
 <file path=customXml/item3.xml><?xml version="1.0" encoding="utf-8"?>
 <?mso-contentType ?>
 <FormTemplates xmlns="http://schemas.microsoft.com/sharepoint/v3/contenttype/forms">
@@ -4477,6 +4471,15 @@
 </file>
 
 <file path=customXml/itemProps1.xml><?xml version="1.0" encoding="utf-8"?>
+<ds:datastoreItem xmlns:ds="http://schemas.openxmlformats.org/officeDocument/2006/customXml" ds:itemID="{0028EFB7-3706-477C-BC22-76AF0C752638}">
+  <ds:schemaRefs>
+    <ds:schemaRef ds:uri="http://schemas.microsoft.com/office/2006/metadata/properties"/>
+    <ds:schemaRef ds:uri="http://schemas.microsoft.com/office/infopath/2007/PartnerControls"/>
+  </ds:schemaRefs>
+</ds:datastoreItem>
+</file>
+
+<file path=customXml/itemProps2.xml><?xml version="1.0" encoding="utf-8"?>
 <ds:datastoreItem xmlns:ds="http://schemas.openxmlformats.org/officeDocument/2006/customXml" ds:itemID="{3258D31E-C4C0-4BAE-8DEF-91B5992C0A3A}">
   <ds:schemaRefs>
     <ds:schemaRef ds:uri="http://schemas.microsoft.com/office/2006/metadata/contentType"/>
@@ -4494,15 +4497,6 @@
 </ds:datastoreItem>
 </file>
 
-<file path=customXml/itemProps2.xml><?xml version="1.0" encoding="utf-8"?>
-<ds:datastoreItem xmlns:ds="http://schemas.openxmlformats.org/officeDocument/2006/customXml" ds:itemID="{0028EFB7-3706-477C-BC22-76AF0C752638}">
-  <ds:schemaRefs>
-    <ds:schemaRef ds:uri="http://schemas.microsoft.com/office/2006/metadata/properties"/>
-    <ds:schemaRef ds:uri="http://schemas.microsoft.com/office/infopath/2007/PartnerControls"/>
-  </ds:schemaRefs>
-</ds:datastoreItem>
-</file>
-
 <file path=customXml/itemProps3.xml><?xml version="1.0" encoding="utf-8"?>
 <ds:datastoreItem xmlns:ds="http://schemas.openxmlformats.org/officeDocument/2006/customXml" ds:itemID="{0876BD9A-9CA5-48C2-BF8E-F2DECFB0FD38}">
   <ds:schemaRefs>

</xml_diff>